<commit_message>
feat(quiz-engine): unify 8-rule pedagogical engine, adaptive queue, and exam import pipeline
- Implement formal 8-rule pedagogical quiz engine in pedagogicalEngine.js (retrieval spacing, error recovery, interleaved practice, calibration, etc.)
- Modernize adaptiveEngine.js with user-scoped response tracking and migration 045
- Harmonize Flutter QuizController with server state and instant feedback bottom sheet
- Add unit test suites for pedagogical and adaptive engines with 100% pass rate
- Add Hungarian Medical Board question import parser for Tavaszi koreteltan
</commit_message>
<xml_diff>
--- a/PTE_POC_Garami_mod.docx
+++ b/PTE_POC_Garami_mod.docx
@@ -1090,6 +1090,15 @@
               </w:rPr>
               <w:t>fejlesztésér</w:t>
             </w:r>
+            <w:r>
+              <w:rPr>
+                <w:rFonts w:ascii="Garamond" w:hAnsi="Garamond"/>
+                <w:b/>
+                <w:bCs/>
+                <w:lang w:val="en-GB"/>
+              </w:rPr>
+              <w:t>e</w:t>
+            </w:r>
             <w:proofErr w:type="spellEnd"/>
           </w:p>
         </w:tc>
@@ -1340,7 +1349,23 @@
                 <w:b/>
                 <w:bCs/>
               </w:rPr>
-              <w:t>2026.01.01.</w:t>
+              <w:t>2026.0</w:t>
+            </w:r>
+            <w:r>
+              <w:rPr>
+                <w:rFonts w:ascii="Garamond" w:hAnsi="Garamond"/>
+                <w:b/>
+                <w:bCs/>
+              </w:rPr>
+              <w:t>5</w:t>
+            </w:r>
+            <w:r>
+              <w:rPr>
+                <w:rFonts w:ascii="Garamond" w:hAnsi="Garamond"/>
+                <w:b/>
+                <w:bCs/>
+              </w:rPr>
+              <w:t>.01.</w:t>
             </w:r>
             <w:r>
               <w:rPr>
@@ -1396,7 +1421,7 @@
                 <w:b/>
                 <w:bCs/>
               </w:rPr>
-              <w:t>1</w:t>
+              <w:t>5</w:t>
             </w:r>
             <w:r>
               <w:rPr>

</xml_diff>